<commit_message>
Update site and docs mobile UI, QR generation, and gallery catalog output
</commit_message>
<xml_diff>
--- a/site/gallery_catalog.docx
+++ b/site/gallery_catalog.docx
@@ -30,25 +30,14 @@
         <w:tblLook w:firstColumn="1" w:firstRow="1" w:lastColumn="0" w:lastRow="0" w:noHBand="0" w:noVBand="1" w:val="04A0"/>
       </w:tblPr>
       <w:tblGrid>
-        <w:gridCol w:w="2160"/>
-        <w:gridCol w:w="2160"/>
-        <w:gridCol w:w="2160"/>
-        <w:gridCol w:w="2160"/>
+        <w:gridCol w:w="2880"/>
+        <w:gridCol w:w="2880"/>
+        <w:gridCol w:w="2880"/>
       </w:tblGrid>
       <w:tr>
         <w:tc>
           <w:tcPr>
-            <w:tcW w:type="dxa" w:w="2160"/>
-          </w:tcPr>
-          <w:p>
-            <w:r>
-              <w:t>№</w:t>
-            </w:r>
-          </w:p>
-        </w:tc>
-        <w:tc>
-          <w:tcPr>
-            <w:tcW w:type="dxa" w:w="2160"/>
+            <w:tcW w:type="dxa" w:w="2880"/>
           </w:tcPr>
           <w:p>
             <w:r>
@@ -58,7 +47,7 @@
         </w:tc>
         <w:tc>
           <w:tcPr>
-            <w:tcW w:type="dxa" w:w="2160"/>
+            <w:tcW w:type="dxa" w:w="2880"/>
           </w:tcPr>
           <w:p>
             <w:r>
@@ -68,7 +57,7 @@
         </w:tc>
         <w:tc>
           <w:tcPr>
-            <w:tcW w:type="dxa" w:w="2160"/>
+            <w:tcW w:type="dxa" w:w="2880"/>
           </w:tcPr>
           <w:p>
             <w:r>
@@ -80,17 +69,7 @@
       <w:tr>
         <w:tc>
           <w:tcPr>
-            <w:tcW w:type="dxa" w:w="2160"/>
-          </w:tcPr>
-          <w:p>
-            <w:r>
-              <w:t>1</w:t>
-            </w:r>
-          </w:p>
-        </w:tc>
-        <w:tc>
-          <w:tcPr>
-            <w:tcW w:type="dxa" w:w="2160"/>
+            <w:tcW w:type="dxa" w:w="2880"/>
           </w:tcPr>
           <w:p>
             <w:r>
@@ -102,7 +81,7 @@
         </w:tc>
         <w:tc>
           <w:tcPr>
-            <w:tcW w:type="dxa" w:w="2160"/>
+            <w:tcW w:type="dxa" w:w="2880"/>
           </w:tcPr>
           <w:p>
             <w:hyperlink r:id="rId9">
@@ -111,14 +90,14 @@
                   <w:color w:val="0000FF"/>
                   <w:u w:val="single"/>
                 </w:rPr>
-                <w:t>https://primgallery.com/#p=1</w:t>
+                <w:t>https://aganimka.github.io/Gallery-site/#p=1</w:t>
               </w:r>
             </w:hyperlink>
           </w:p>
         </w:tc>
         <w:tc>
           <w:tcPr>
-            <w:tcW w:type="dxa" w:w="2160"/>
+            <w:tcW w:type="dxa" w:w="2880"/>
           </w:tcPr>
           <w:p>
             <w:r>
@@ -161,17 +140,7 @@
       <w:tr>
         <w:tc>
           <w:tcPr>
-            <w:tcW w:type="dxa" w:w="2160"/>
-          </w:tcPr>
-          <w:p>
-            <w:r>
-              <w:t>2</w:t>
-            </w:r>
-          </w:p>
-        </w:tc>
-        <w:tc>
-          <w:tcPr>
-            <w:tcW w:type="dxa" w:w="2160"/>
+            <w:tcW w:type="dxa" w:w="2880"/>
           </w:tcPr>
           <w:p>
             <w:r>
@@ -183,7 +152,7 @@
         </w:tc>
         <w:tc>
           <w:tcPr>
-            <w:tcW w:type="dxa" w:w="2160"/>
+            <w:tcW w:type="dxa" w:w="2880"/>
           </w:tcPr>
           <w:p>
             <w:hyperlink r:id="rId11">
@@ -192,14 +161,14 @@
                   <w:color w:val="0000FF"/>
                   <w:u w:val="single"/>
                 </w:rPr>
-                <w:t>https://primgallery.com/#p=2</w:t>
+                <w:t>https://aganimka.github.io/Gallery-site/#p=2</w:t>
               </w:r>
             </w:hyperlink>
           </w:p>
         </w:tc>
         <w:tc>
           <w:tcPr>
-            <w:tcW w:type="dxa" w:w="2160"/>
+            <w:tcW w:type="dxa" w:w="2880"/>
           </w:tcPr>
           <w:p>
             <w:r>
@@ -242,17 +211,7 @@
       <w:tr>
         <w:tc>
           <w:tcPr>
-            <w:tcW w:type="dxa" w:w="2160"/>
-          </w:tcPr>
-          <w:p>
-            <w:r>
-              <w:t>3</w:t>
-            </w:r>
-          </w:p>
-        </w:tc>
-        <w:tc>
-          <w:tcPr>
-            <w:tcW w:type="dxa" w:w="2160"/>
+            <w:tcW w:type="dxa" w:w="2880"/>
           </w:tcPr>
           <w:p>
             <w:r>
@@ -264,7 +223,7 @@
         </w:tc>
         <w:tc>
           <w:tcPr>
-            <w:tcW w:type="dxa" w:w="2160"/>
+            <w:tcW w:type="dxa" w:w="2880"/>
           </w:tcPr>
           <w:p>
             <w:hyperlink r:id="rId13">
@@ -273,14 +232,14 @@
                   <w:color w:val="0000FF"/>
                   <w:u w:val="single"/>
                 </w:rPr>
-                <w:t>https://primgallery.com/#p=3</w:t>
+                <w:t>https://aganimka.github.io/Gallery-site/#p=3</w:t>
               </w:r>
             </w:hyperlink>
           </w:p>
         </w:tc>
         <w:tc>
           <w:tcPr>
-            <w:tcW w:type="dxa" w:w="2160"/>
+            <w:tcW w:type="dxa" w:w="2880"/>
           </w:tcPr>
           <w:p>
             <w:r>
@@ -323,17 +282,7 @@
       <w:tr>
         <w:tc>
           <w:tcPr>
-            <w:tcW w:type="dxa" w:w="2160"/>
-          </w:tcPr>
-          <w:p>
-            <w:r>
-              <w:t>4</w:t>
-            </w:r>
-          </w:p>
-        </w:tc>
-        <w:tc>
-          <w:tcPr>
-            <w:tcW w:type="dxa" w:w="2160"/>
+            <w:tcW w:type="dxa" w:w="2880"/>
           </w:tcPr>
           <w:p>
             <w:r>
@@ -345,7 +294,7 @@
         </w:tc>
         <w:tc>
           <w:tcPr>
-            <w:tcW w:type="dxa" w:w="2160"/>
+            <w:tcW w:type="dxa" w:w="2880"/>
           </w:tcPr>
           <w:p>
             <w:hyperlink r:id="rId15">
@@ -354,14 +303,14 @@
                   <w:color w:val="0000FF"/>
                   <w:u w:val="single"/>
                 </w:rPr>
-                <w:t>https://primgallery.com/#p=4</w:t>
+                <w:t>https://aganimka.github.io/Gallery-site/#p=4</w:t>
               </w:r>
             </w:hyperlink>
           </w:p>
         </w:tc>
         <w:tc>
           <w:tcPr>
-            <w:tcW w:type="dxa" w:w="2160"/>
+            <w:tcW w:type="dxa" w:w="2880"/>
           </w:tcPr>
           <w:p>
             <w:r>
@@ -404,17 +353,7 @@
       <w:tr>
         <w:tc>
           <w:tcPr>
-            <w:tcW w:type="dxa" w:w="2160"/>
-          </w:tcPr>
-          <w:p>
-            <w:r>
-              <w:t>5</w:t>
-            </w:r>
-          </w:p>
-        </w:tc>
-        <w:tc>
-          <w:tcPr>
-            <w:tcW w:type="dxa" w:w="2160"/>
+            <w:tcW w:type="dxa" w:w="2880"/>
           </w:tcPr>
           <w:p>
             <w:r>
@@ -426,7 +365,7 @@
         </w:tc>
         <w:tc>
           <w:tcPr>
-            <w:tcW w:type="dxa" w:w="2160"/>
+            <w:tcW w:type="dxa" w:w="2880"/>
           </w:tcPr>
           <w:p>
             <w:hyperlink r:id="rId17">
@@ -435,14 +374,14 @@
                   <w:color w:val="0000FF"/>
                   <w:u w:val="single"/>
                 </w:rPr>
-                <w:t>https://primgallery.com/#p=5</w:t>
+                <w:t>https://aganimka.github.io/Gallery-site/#p=5</w:t>
               </w:r>
             </w:hyperlink>
           </w:p>
         </w:tc>
         <w:tc>
           <w:tcPr>
-            <w:tcW w:type="dxa" w:w="2160"/>
+            <w:tcW w:type="dxa" w:w="2880"/>
           </w:tcPr>
           <w:p>
             <w:r>
@@ -485,17 +424,7 @@
       <w:tr>
         <w:tc>
           <w:tcPr>
-            <w:tcW w:type="dxa" w:w="2160"/>
-          </w:tcPr>
-          <w:p>
-            <w:r>
-              <w:t>6</w:t>
-            </w:r>
-          </w:p>
-        </w:tc>
-        <w:tc>
-          <w:tcPr>
-            <w:tcW w:type="dxa" w:w="2160"/>
+            <w:tcW w:type="dxa" w:w="2880"/>
           </w:tcPr>
           <w:p>
             <w:r>
@@ -507,7 +436,7 @@
         </w:tc>
         <w:tc>
           <w:tcPr>
-            <w:tcW w:type="dxa" w:w="2160"/>
+            <w:tcW w:type="dxa" w:w="2880"/>
           </w:tcPr>
           <w:p>
             <w:hyperlink r:id="rId19">
@@ -516,14 +445,14 @@
                   <w:color w:val="0000FF"/>
                   <w:u w:val="single"/>
                 </w:rPr>
-                <w:t>https://primgallery.com/#p=6</w:t>
+                <w:t>https://aganimka.github.io/Gallery-site/#p=6</w:t>
               </w:r>
             </w:hyperlink>
           </w:p>
         </w:tc>
         <w:tc>
           <w:tcPr>
-            <w:tcW w:type="dxa" w:w="2160"/>
+            <w:tcW w:type="dxa" w:w="2880"/>
           </w:tcPr>
           <w:p>
             <w:r>
@@ -566,17 +495,7 @@
       <w:tr>
         <w:tc>
           <w:tcPr>
-            <w:tcW w:type="dxa" w:w="2160"/>
-          </w:tcPr>
-          <w:p>
-            <w:r>
-              <w:t>7</w:t>
-            </w:r>
-          </w:p>
-        </w:tc>
-        <w:tc>
-          <w:tcPr>
-            <w:tcW w:type="dxa" w:w="2160"/>
+            <w:tcW w:type="dxa" w:w="2880"/>
           </w:tcPr>
           <w:p>
             <w:r>
@@ -588,7 +507,7 @@
         </w:tc>
         <w:tc>
           <w:tcPr>
-            <w:tcW w:type="dxa" w:w="2160"/>
+            <w:tcW w:type="dxa" w:w="2880"/>
           </w:tcPr>
           <w:p>
             <w:hyperlink r:id="rId21">
@@ -597,14 +516,14 @@
                   <w:color w:val="0000FF"/>
                   <w:u w:val="single"/>
                 </w:rPr>
-                <w:t>https://primgallery.com/#p=7</w:t>
+                <w:t>https://aganimka.github.io/Gallery-site/#p=7</w:t>
               </w:r>
             </w:hyperlink>
           </w:p>
         </w:tc>
         <w:tc>
           <w:tcPr>
-            <w:tcW w:type="dxa" w:w="2160"/>
+            <w:tcW w:type="dxa" w:w="2880"/>
           </w:tcPr>
           <w:p>
             <w:r>
@@ -647,17 +566,7 @@
       <w:tr>
         <w:tc>
           <w:tcPr>
-            <w:tcW w:type="dxa" w:w="2160"/>
-          </w:tcPr>
-          <w:p>
-            <w:r>
-              <w:t>8</w:t>
-            </w:r>
-          </w:p>
-        </w:tc>
-        <w:tc>
-          <w:tcPr>
-            <w:tcW w:type="dxa" w:w="2160"/>
+            <w:tcW w:type="dxa" w:w="2880"/>
           </w:tcPr>
           <w:p>
             <w:r>
@@ -669,7 +578,7 @@
         </w:tc>
         <w:tc>
           <w:tcPr>
-            <w:tcW w:type="dxa" w:w="2160"/>
+            <w:tcW w:type="dxa" w:w="2880"/>
           </w:tcPr>
           <w:p>
             <w:hyperlink r:id="rId23">
@@ -678,14 +587,14 @@
                   <w:color w:val="0000FF"/>
                   <w:u w:val="single"/>
                 </w:rPr>
-                <w:t>https://primgallery.com/#p=8</w:t>
+                <w:t>https://aganimka.github.io/Gallery-site/#p=8</w:t>
               </w:r>
             </w:hyperlink>
           </w:p>
         </w:tc>
         <w:tc>
           <w:tcPr>
-            <w:tcW w:type="dxa" w:w="2160"/>
+            <w:tcW w:type="dxa" w:w="2880"/>
           </w:tcPr>
           <w:p>
             <w:r>
@@ -728,17 +637,7 @@
       <w:tr>
         <w:tc>
           <w:tcPr>
-            <w:tcW w:type="dxa" w:w="2160"/>
-          </w:tcPr>
-          <w:p>
-            <w:r>
-              <w:t>9</w:t>
-            </w:r>
-          </w:p>
-        </w:tc>
-        <w:tc>
-          <w:tcPr>
-            <w:tcW w:type="dxa" w:w="2160"/>
+            <w:tcW w:type="dxa" w:w="2880"/>
           </w:tcPr>
           <w:p>
             <w:r>
@@ -750,7 +649,7 @@
         </w:tc>
         <w:tc>
           <w:tcPr>
-            <w:tcW w:type="dxa" w:w="2160"/>
+            <w:tcW w:type="dxa" w:w="2880"/>
           </w:tcPr>
           <w:p>
             <w:hyperlink r:id="rId25">
@@ -759,14 +658,14 @@
                   <w:color w:val="0000FF"/>
                   <w:u w:val="single"/>
                 </w:rPr>
-                <w:t>https://primgallery.com/#p=9</w:t>
+                <w:t>https://aganimka.github.io/Gallery-site/#p=9</w:t>
               </w:r>
             </w:hyperlink>
           </w:p>
         </w:tc>
         <w:tc>
           <w:tcPr>
-            <w:tcW w:type="dxa" w:w="2160"/>
+            <w:tcW w:type="dxa" w:w="2880"/>
           </w:tcPr>
           <w:p>
             <w:r>
@@ -809,17 +708,7 @@
       <w:tr>
         <w:tc>
           <w:tcPr>
-            <w:tcW w:type="dxa" w:w="2160"/>
-          </w:tcPr>
-          <w:p>
-            <w:r>
-              <w:t>10</w:t>
-            </w:r>
-          </w:p>
-        </w:tc>
-        <w:tc>
-          <w:tcPr>
-            <w:tcW w:type="dxa" w:w="2160"/>
+            <w:tcW w:type="dxa" w:w="2880"/>
           </w:tcPr>
           <w:p>
             <w:r>
@@ -831,7 +720,7 @@
         </w:tc>
         <w:tc>
           <w:tcPr>
-            <w:tcW w:type="dxa" w:w="2160"/>
+            <w:tcW w:type="dxa" w:w="2880"/>
           </w:tcPr>
           <w:p>
             <w:hyperlink r:id="rId27">
@@ -840,14 +729,14 @@
                   <w:color w:val="0000FF"/>
                   <w:u w:val="single"/>
                 </w:rPr>
-                <w:t>https://primgallery.com/#p=10</w:t>
+                <w:t>https://aganimka.github.io/Gallery-site/#p=10</w:t>
               </w:r>
             </w:hyperlink>
           </w:p>
         </w:tc>
         <w:tc>
           <w:tcPr>
-            <w:tcW w:type="dxa" w:w="2160"/>
+            <w:tcW w:type="dxa" w:w="2880"/>
           </w:tcPr>
           <w:p>
             <w:r>
@@ -890,17 +779,7 @@
       <w:tr>
         <w:tc>
           <w:tcPr>
-            <w:tcW w:type="dxa" w:w="2160"/>
-          </w:tcPr>
-          <w:p>
-            <w:r>
-              <w:t>11</w:t>
-            </w:r>
-          </w:p>
-        </w:tc>
-        <w:tc>
-          <w:tcPr>
-            <w:tcW w:type="dxa" w:w="2160"/>
+            <w:tcW w:type="dxa" w:w="2880"/>
           </w:tcPr>
           <w:p>
             <w:r>
@@ -912,7 +791,7 @@
         </w:tc>
         <w:tc>
           <w:tcPr>
-            <w:tcW w:type="dxa" w:w="2160"/>
+            <w:tcW w:type="dxa" w:w="2880"/>
           </w:tcPr>
           <w:p>
             <w:hyperlink r:id="rId29">
@@ -921,14 +800,14 @@
                   <w:color w:val="0000FF"/>
                   <w:u w:val="single"/>
                 </w:rPr>
-                <w:t>https://primgallery.com/#p=11</w:t>
+                <w:t>https://aganimka.github.io/Gallery-site/#p=11</w:t>
               </w:r>
             </w:hyperlink>
           </w:p>
         </w:tc>
         <w:tc>
           <w:tcPr>
-            <w:tcW w:type="dxa" w:w="2160"/>
+            <w:tcW w:type="dxa" w:w="2880"/>
           </w:tcPr>
           <w:p>
             <w:r>
@@ -971,17 +850,7 @@
       <w:tr>
         <w:tc>
           <w:tcPr>
-            <w:tcW w:type="dxa" w:w="2160"/>
-          </w:tcPr>
-          <w:p>
-            <w:r>
-              <w:t>12</w:t>
-            </w:r>
-          </w:p>
-        </w:tc>
-        <w:tc>
-          <w:tcPr>
-            <w:tcW w:type="dxa" w:w="2160"/>
+            <w:tcW w:type="dxa" w:w="2880"/>
           </w:tcPr>
           <w:p>
             <w:r>
@@ -993,7 +862,7 @@
         </w:tc>
         <w:tc>
           <w:tcPr>
-            <w:tcW w:type="dxa" w:w="2160"/>
+            <w:tcW w:type="dxa" w:w="2880"/>
           </w:tcPr>
           <w:p>
             <w:hyperlink r:id="rId31">
@@ -1002,14 +871,14 @@
                   <w:color w:val="0000FF"/>
                   <w:u w:val="single"/>
                 </w:rPr>
-                <w:t>https://primgallery.com/#p=12</w:t>
+                <w:t>https://aganimka.github.io/Gallery-site/#p=12</w:t>
               </w:r>
             </w:hyperlink>
           </w:p>
         </w:tc>
         <w:tc>
           <w:tcPr>
-            <w:tcW w:type="dxa" w:w="2160"/>
+            <w:tcW w:type="dxa" w:w="2880"/>
           </w:tcPr>
           <w:p>
             <w:r>
@@ -1052,17 +921,7 @@
       <w:tr>
         <w:tc>
           <w:tcPr>
-            <w:tcW w:type="dxa" w:w="2160"/>
-          </w:tcPr>
-          <w:p>
-            <w:r>
-              <w:t>13</w:t>
-            </w:r>
-          </w:p>
-        </w:tc>
-        <w:tc>
-          <w:tcPr>
-            <w:tcW w:type="dxa" w:w="2160"/>
+            <w:tcW w:type="dxa" w:w="2880"/>
           </w:tcPr>
           <w:p>
             <w:r>
@@ -1074,7 +933,7 @@
         </w:tc>
         <w:tc>
           <w:tcPr>
-            <w:tcW w:type="dxa" w:w="2160"/>
+            <w:tcW w:type="dxa" w:w="2880"/>
           </w:tcPr>
           <w:p>
             <w:hyperlink r:id="rId33">
@@ -1083,14 +942,14 @@
                   <w:color w:val="0000FF"/>
                   <w:u w:val="single"/>
                 </w:rPr>
-                <w:t>https://primgallery.com/#p=13</w:t>
+                <w:t>https://aganimka.github.io/Gallery-site/#p=13</w:t>
               </w:r>
             </w:hyperlink>
           </w:p>
         </w:tc>
         <w:tc>
           <w:tcPr>
-            <w:tcW w:type="dxa" w:w="2160"/>
+            <w:tcW w:type="dxa" w:w="2880"/>
           </w:tcPr>
           <w:p>
             <w:r>
@@ -1133,17 +992,7 @@
       <w:tr>
         <w:tc>
           <w:tcPr>
-            <w:tcW w:type="dxa" w:w="2160"/>
-          </w:tcPr>
-          <w:p>
-            <w:r>
-              <w:t>14</w:t>
-            </w:r>
-          </w:p>
-        </w:tc>
-        <w:tc>
-          <w:tcPr>
-            <w:tcW w:type="dxa" w:w="2160"/>
+            <w:tcW w:type="dxa" w:w="2880"/>
           </w:tcPr>
           <w:p>
             <w:r>
@@ -1155,7 +1004,7 @@
         </w:tc>
         <w:tc>
           <w:tcPr>
-            <w:tcW w:type="dxa" w:w="2160"/>
+            <w:tcW w:type="dxa" w:w="2880"/>
           </w:tcPr>
           <w:p>
             <w:hyperlink r:id="rId35">
@@ -1164,14 +1013,14 @@
                   <w:color w:val="0000FF"/>
                   <w:u w:val="single"/>
                 </w:rPr>
-                <w:t>https://primgallery.com/#p=14</w:t>
+                <w:t>https://aganimka.github.io/Gallery-site/#p=14</w:t>
               </w:r>
             </w:hyperlink>
           </w:p>
         </w:tc>
         <w:tc>
           <w:tcPr>
-            <w:tcW w:type="dxa" w:w="2160"/>
+            <w:tcW w:type="dxa" w:w="2880"/>
           </w:tcPr>
           <w:p>
             <w:r>
@@ -1214,17 +1063,7 @@
       <w:tr>
         <w:tc>
           <w:tcPr>
-            <w:tcW w:type="dxa" w:w="2160"/>
-          </w:tcPr>
-          <w:p>
-            <w:r>
-              <w:t>15</w:t>
-            </w:r>
-          </w:p>
-        </w:tc>
-        <w:tc>
-          <w:tcPr>
-            <w:tcW w:type="dxa" w:w="2160"/>
+            <w:tcW w:type="dxa" w:w="2880"/>
           </w:tcPr>
           <w:p>
             <w:r>
@@ -1236,7 +1075,7 @@
         </w:tc>
         <w:tc>
           <w:tcPr>
-            <w:tcW w:type="dxa" w:w="2160"/>
+            <w:tcW w:type="dxa" w:w="2880"/>
           </w:tcPr>
           <w:p>
             <w:hyperlink r:id="rId37">
@@ -1245,14 +1084,14 @@
                   <w:color w:val="0000FF"/>
                   <w:u w:val="single"/>
                 </w:rPr>
-                <w:t>https://primgallery.com/#p=15</w:t>
+                <w:t>https://aganimka.github.io/Gallery-site/#p=15</w:t>
               </w:r>
             </w:hyperlink>
           </w:p>
         </w:tc>
         <w:tc>
           <w:tcPr>
-            <w:tcW w:type="dxa" w:w="2160"/>
+            <w:tcW w:type="dxa" w:w="2880"/>
           </w:tcPr>
           <w:p>
             <w:r>
@@ -1295,17 +1134,7 @@
       <w:tr>
         <w:tc>
           <w:tcPr>
-            <w:tcW w:type="dxa" w:w="2160"/>
-          </w:tcPr>
-          <w:p>
-            <w:r>
-              <w:t>16</w:t>
-            </w:r>
-          </w:p>
-        </w:tc>
-        <w:tc>
-          <w:tcPr>
-            <w:tcW w:type="dxa" w:w="2160"/>
+            <w:tcW w:type="dxa" w:w="2880"/>
           </w:tcPr>
           <w:p>
             <w:r>
@@ -1317,7 +1146,7 @@
         </w:tc>
         <w:tc>
           <w:tcPr>
-            <w:tcW w:type="dxa" w:w="2160"/>
+            <w:tcW w:type="dxa" w:w="2880"/>
           </w:tcPr>
           <w:p>
             <w:hyperlink r:id="rId39">
@@ -1326,14 +1155,14 @@
                   <w:color w:val="0000FF"/>
                   <w:u w:val="single"/>
                 </w:rPr>
-                <w:t>https://primgallery.com/#p=16</w:t>
+                <w:t>https://aganimka.github.io/Gallery-site/#p=16</w:t>
               </w:r>
             </w:hyperlink>
           </w:p>
         </w:tc>
         <w:tc>
           <w:tcPr>
-            <w:tcW w:type="dxa" w:w="2160"/>
+            <w:tcW w:type="dxa" w:w="2880"/>
           </w:tcPr>
           <w:p>
             <w:r>
@@ -1376,17 +1205,7 @@
       <w:tr>
         <w:tc>
           <w:tcPr>
-            <w:tcW w:type="dxa" w:w="2160"/>
-          </w:tcPr>
-          <w:p>
-            <w:r>
-              <w:t>17</w:t>
-            </w:r>
-          </w:p>
-        </w:tc>
-        <w:tc>
-          <w:tcPr>
-            <w:tcW w:type="dxa" w:w="2160"/>
+            <w:tcW w:type="dxa" w:w="2880"/>
           </w:tcPr>
           <w:p>
             <w:r>
@@ -1398,7 +1217,7 @@
         </w:tc>
         <w:tc>
           <w:tcPr>
-            <w:tcW w:type="dxa" w:w="2160"/>
+            <w:tcW w:type="dxa" w:w="2880"/>
           </w:tcPr>
           <w:p>
             <w:hyperlink r:id="rId41">
@@ -1407,14 +1226,14 @@
                   <w:color w:val="0000FF"/>
                   <w:u w:val="single"/>
                 </w:rPr>
-                <w:t>https://primgallery.com/#p=17</w:t>
+                <w:t>https://aganimka.github.io/Gallery-site/#p=17</w:t>
               </w:r>
             </w:hyperlink>
           </w:p>
         </w:tc>
         <w:tc>
           <w:tcPr>
-            <w:tcW w:type="dxa" w:w="2160"/>
+            <w:tcW w:type="dxa" w:w="2880"/>
           </w:tcPr>
           <w:p>
             <w:r>
@@ -1457,17 +1276,7 @@
       <w:tr>
         <w:tc>
           <w:tcPr>
-            <w:tcW w:type="dxa" w:w="2160"/>
-          </w:tcPr>
-          <w:p>
-            <w:r>
-              <w:t>18</w:t>
-            </w:r>
-          </w:p>
-        </w:tc>
-        <w:tc>
-          <w:tcPr>
-            <w:tcW w:type="dxa" w:w="2160"/>
+            <w:tcW w:type="dxa" w:w="2880"/>
           </w:tcPr>
           <w:p>
             <w:r>
@@ -1479,7 +1288,7 @@
         </w:tc>
         <w:tc>
           <w:tcPr>
-            <w:tcW w:type="dxa" w:w="2160"/>
+            <w:tcW w:type="dxa" w:w="2880"/>
           </w:tcPr>
           <w:p>
             <w:hyperlink r:id="rId43">
@@ -1488,14 +1297,14 @@
                   <w:color w:val="0000FF"/>
                   <w:u w:val="single"/>
                 </w:rPr>
-                <w:t>https://primgallery.com/#p=18</w:t>
+                <w:t>https://aganimka.github.io/Gallery-site/#p=18</w:t>
               </w:r>
             </w:hyperlink>
           </w:p>
         </w:tc>
         <w:tc>
           <w:tcPr>
-            <w:tcW w:type="dxa" w:w="2160"/>
+            <w:tcW w:type="dxa" w:w="2880"/>
           </w:tcPr>
           <w:p>
             <w:r>
@@ -1538,17 +1347,7 @@
       <w:tr>
         <w:tc>
           <w:tcPr>
-            <w:tcW w:type="dxa" w:w="2160"/>
-          </w:tcPr>
-          <w:p>
-            <w:r>
-              <w:t>19</w:t>
-            </w:r>
-          </w:p>
-        </w:tc>
-        <w:tc>
-          <w:tcPr>
-            <w:tcW w:type="dxa" w:w="2160"/>
+            <w:tcW w:type="dxa" w:w="2880"/>
           </w:tcPr>
           <w:p>
             <w:r>
@@ -1560,7 +1359,7 @@
         </w:tc>
         <w:tc>
           <w:tcPr>
-            <w:tcW w:type="dxa" w:w="2160"/>
+            <w:tcW w:type="dxa" w:w="2880"/>
           </w:tcPr>
           <w:p>
             <w:hyperlink r:id="rId45">
@@ -1569,14 +1368,14 @@
                   <w:color w:val="0000FF"/>
                   <w:u w:val="single"/>
                 </w:rPr>
-                <w:t>https://primgallery.com/#p=19</w:t>
+                <w:t>https://aganimka.github.io/Gallery-site/#p=19</w:t>
               </w:r>
             </w:hyperlink>
           </w:p>
         </w:tc>
         <w:tc>
           <w:tcPr>
-            <w:tcW w:type="dxa" w:w="2160"/>
+            <w:tcW w:type="dxa" w:w="2880"/>
           </w:tcPr>
           <w:p>
             <w:r>
@@ -1619,17 +1418,7 @@
       <w:tr>
         <w:tc>
           <w:tcPr>
-            <w:tcW w:type="dxa" w:w="2160"/>
-          </w:tcPr>
-          <w:p>
-            <w:r>
-              <w:t>20</w:t>
-            </w:r>
-          </w:p>
-        </w:tc>
-        <w:tc>
-          <w:tcPr>
-            <w:tcW w:type="dxa" w:w="2160"/>
+            <w:tcW w:type="dxa" w:w="2880"/>
           </w:tcPr>
           <w:p>
             <w:r>
@@ -1641,7 +1430,7 @@
         </w:tc>
         <w:tc>
           <w:tcPr>
-            <w:tcW w:type="dxa" w:w="2160"/>
+            <w:tcW w:type="dxa" w:w="2880"/>
           </w:tcPr>
           <w:p>
             <w:hyperlink r:id="rId47">
@@ -1650,14 +1439,14 @@
                   <w:color w:val="0000FF"/>
                   <w:u w:val="single"/>
                 </w:rPr>
-                <w:t>https://primgallery.com/#p=20</w:t>
+                <w:t>https://aganimka.github.io/Gallery-site/#p=20</w:t>
               </w:r>
             </w:hyperlink>
           </w:p>
         </w:tc>
         <w:tc>
           <w:tcPr>
-            <w:tcW w:type="dxa" w:w="2160"/>
+            <w:tcW w:type="dxa" w:w="2880"/>
           </w:tcPr>
           <w:p>
             <w:r>
@@ -1700,17 +1489,7 @@
       <w:tr>
         <w:tc>
           <w:tcPr>
-            <w:tcW w:type="dxa" w:w="2160"/>
-          </w:tcPr>
-          <w:p>
-            <w:r>
-              <w:t>21</w:t>
-            </w:r>
-          </w:p>
-        </w:tc>
-        <w:tc>
-          <w:tcPr>
-            <w:tcW w:type="dxa" w:w="2160"/>
+            <w:tcW w:type="dxa" w:w="2880"/>
           </w:tcPr>
           <w:p>
             <w:r>
@@ -1722,7 +1501,7 @@
         </w:tc>
         <w:tc>
           <w:tcPr>
-            <w:tcW w:type="dxa" w:w="2160"/>
+            <w:tcW w:type="dxa" w:w="2880"/>
           </w:tcPr>
           <w:p>
             <w:hyperlink r:id="rId49">
@@ -1731,14 +1510,14 @@
                   <w:color w:val="0000FF"/>
                   <w:u w:val="single"/>
                 </w:rPr>
-                <w:t>https://primgallery.com/#p=21</w:t>
+                <w:t>https://aganimka.github.io/Gallery-site/#p=21</w:t>
               </w:r>
             </w:hyperlink>
           </w:p>
         </w:tc>
         <w:tc>
           <w:tcPr>
-            <w:tcW w:type="dxa" w:w="2160"/>
+            <w:tcW w:type="dxa" w:w="2880"/>
           </w:tcPr>
           <w:p>
             <w:r>
@@ -1781,17 +1560,7 @@
       <w:tr>
         <w:tc>
           <w:tcPr>
-            <w:tcW w:type="dxa" w:w="2160"/>
-          </w:tcPr>
-          <w:p>
-            <w:r>
-              <w:t>22</w:t>
-            </w:r>
-          </w:p>
-        </w:tc>
-        <w:tc>
-          <w:tcPr>
-            <w:tcW w:type="dxa" w:w="2160"/>
+            <w:tcW w:type="dxa" w:w="2880"/>
           </w:tcPr>
           <w:p>
             <w:r>
@@ -1803,7 +1572,7 @@
         </w:tc>
         <w:tc>
           <w:tcPr>
-            <w:tcW w:type="dxa" w:w="2160"/>
+            <w:tcW w:type="dxa" w:w="2880"/>
           </w:tcPr>
           <w:p>
             <w:hyperlink r:id="rId51">
@@ -1812,14 +1581,14 @@
                   <w:color w:val="0000FF"/>
                   <w:u w:val="single"/>
                 </w:rPr>
-                <w:t>https://primgallery.com/#p=22</w:t>
+                <w:t>https://aganimka.github.io/Gallery-site/#p=22</w:t>
               </w:r>
             </w:hyperlink>
           </w:p>
         </w:tc>
         <w:tc>
           <w:tcPr>
-            <w:tcW w:type="dxa" w:w="2160"/>
+            <w:tcW w:type="dxa" w:w="2880"/>
           </w:tcPr>
           <w:p>
             <w:r>
@@ -1862,17 +1631,7 @@
       <w:tr>
         <w:tc>
           <w:tcPr>
-            <w:tcW w:type="dxa" w:w="2160"/>
-          </w:tcPr>
-          <w:p>
-            <w:r>
-              <w:t>23</w:t>
-            </w:r>
-          </w:p>
-        </w:tc>
-        <w:tc>
-          <w:tcPr>
-            <w:tcW w:type="dxa" w:w="2160"/>
+            <w:tcW w:type="dxa" w:w="2880"/>
           </w:tcPr>
           <w:p>
             <w:r>
@@ -1884,7 +1643,7 @@
         </w:tc>
         <w:tc>
           <w:tcPr>
-            <w:tcW w:type="dxa" w:w="2160"/>
+            <w:tcW w:type="dxa" w:w="2880"/>
           </w:tcPr>
           <w:p>
             <w:hyperlink r:id="rId53">
@@ -1893,14 +1652,14 @@
                   <w:color w:val="0000FF"/>
                   <w:u w:val="single"/>
                 </w:rPr>
-                <w:t>https://primgallery.com/#p=23</w:t>
+                <w:t>https://aganimka.github.io/Gallery-site/#p=23</w:t>
               </w:r>
             </w:hyperlink>
           </w:p>
         </w:tc>
         <w:tc>
           <w:tcPr>
-            <w:tcW w:type="dxa" w:w="2160"/>
+            <w:tcW w:type="dxa" w:w="2880"/>
           </w:tcPr>
           <w:p>
             <w:r>
@@ -1943,17 +1702,7 @@
       <w:tr>
         <w:tc>
           <w:tcPr>
-            <w:tcW w:type="dxa" w:w="2160"/>
-          </w:tcPr>
-          <w:p>
-            <w:r>
-              <w:t>24</w:t>
-            </w:r>
-          </w:p>
-        </w:tc>
-        <w:tc>
-          <w:tcPr>
-            <w:tcW w:type="dxa" w:w="2160"/>
+            <w:tcW w:type="dxa" w:w="2880"/>
           </w:tcPr>
           <w:p>
             <w:r>
@@ -1965,7 +1714,7 @@
         </w:tc>
         <w:tc>
           <w:tcPr>
-            <w:tcW w:type="dxa" w:w="2160"/>
+            <w:tcW w:type="dxa" w:w="2880"/>
           </w:tcPr>
           <w:p>
             <w:hyperlink r:id="rId55">
@@ -1974,14 +1723,14 @@
                   <w:color w:val="0000FF"/>
                   <w:u w:val="single"/>
                 </w:rPr>
-                <w:t>https://primgallery.com/#p=24</w:t>
+                <w:t>https://aganimka.github.io/Gallery-site/#p=24</w:t>
               </w:r>
             </w:hyperlink>
           </w:p>
         </w:tc>
         <w:tc>
           <w:tcPr>
-            <w:tcW w:type="dxa" w:w="2160"/>
+            <w:tcW w:type="dxa" w:w="2880"/>
           </w:tcPr>
           <w:p>
             <w:r>
@@ -2024,17 +1773,7 @@
       <w:tr>
         <w:tc>
           <w:tcPr>
-            <w:tcW w:type="dxa" w:w="2160"/>
-          </w:tcPr>
-          <w:p>
-            <w:r>
-              <w:t>25</w:t>
-            </w:r>
-          </w:p>
-        </w:tc>
-        <w:tc>
-          <w:tcPr>
-            <w:tcW w:type="dxa" w:w="2160"/>
+            <w:tcW w:type="dxa" w:w="2880"/>
           </w:tcPr>
           <w:p>
             <w:r>
@@ -2046,7 +1785,7 @@
         </w:tc>
         <w:tc>
           <w:tcPr>
-            <w:tcW w:type="dxa" w:w="2160"/>
+            <w:tcW w:type="dxa" w:w="2880"/>
           </w:tcPr>
           <w:p>
             <w:hyperlink r:id="rId57">
@@ -2055,14 +1794,14 @@
                   <w:color w:val="0000FF"/>
                   <w:u w:val="single"/>
                 </w:rPr>
-                <w:t>https://primgallery.com/#p=25</w:t>
+                <w:t>https://aganimka.github.io/Gallery-site/#p=25</w:t>
               </w:r>
             </w:hyperlink>
           </w:p>
         </w:tc>
         <w:tc>
           <w:tcPr>
-            <w:tcW w:type="dxa" w:w="2160"/>
+            <w:tcW w:type="dxa" w:w="2880"/>
           </w:tcPr>
           <w:p>
             <w:r>
@@ -2105,17 +1844,7 @@
       <w:tr>
         <w:tc>
           <w:tcPr>
-            <w:tcW w:type="dxa" w:w="2160"/>
-          </w:tcPr>
-          <w:p>
-            <w:r>
-              <w:t>26</w:t>
-            </w:r>
-          </w:p>
-        </w:tc>
-        <w:tc>
-          <w:tcPr>
-            <w:tcW w:type="dxa" w:w="2160"/>
+            <w:tcW w:type="dxa" w:w="2880"/>
           </w:tcPr>
           <w:p>
             <w:r>
@@ -2127,7 +1856,7 @@
         </w:tc>
         <w:tc>
           <w:tcPr>
-            <w:tcW w:type="dxa" w:w="2160"/>
+            <w:tcW w:type="dxa" w:w="2880"/>
           </w:tcPr>
           <w:p>
             <w:hyperlink r:id="rId59">
@@ -2136,14 +1865,14 @@
                   <w:color w:val="0000FF"/>
                   <w:u w:val="single"/>
                 </w:rPr>
-                <w:t>https://primgallery.com/#p=26</w:t>
+                <w:t>https://aganimka.github.io/Gallery-site/#p=26</w:t>
               </w:r>
             </w:hyperlink>
           </w:p>
         </w:tc>
         <w:tc>
           <w:tcPr>
-            <w:tcW w:type="dxa" w:w="2160"/>
+            <w:tcW w:type="dxa" w:w="2880"/>
           </w:tcPr>
           <w:p>
             <w:r>
@@ -2186,17 +1915,7 @@
       <w:tr>
         <w:tc>
           <w:tcPr>
-            <w:tcW w:type="dxa" w:w="2160"/>
-          </w:tcPr>
-          <w:p>
-            <w:r>
-              <w:t>27</w:t>
-            </w:r>
-          </w:p>
-        </w:tc>
-        <w:tc>
-          <w:tcPr>
-            <w:tcW w:type="dxa" w:w="2160"/>
+            <w:tcW w:type="dxa" w:w="2880"/>
           </w:tcPr>
           <w:p>
             <w:r>
@@ -2208,7 +1927,7 @@
         </w:tc>
         <w:tc>
           <w:tcPr>
-            <w:tcW w:type="dxa" w:w="2160"/>
+            <w:tcW w:type="dxa" w:w="2880"/>
           </w:tcPr>
           <w:p>
             <w:hyperlink r:id="rId61">
@@ -2217,14 +1936,14 @@
                   <w:color w:val="0000FF"/>
                   <w:u w:val="single"/>
                 </w:rPr>
-                <w:t>https://primgallery.com/#p=27</w:t>
+                <w:t>https://aganimka.github.io/Gallery-site/#p=27</w:t>
               </w:r>
             </w:hyperlink>
           </w:p>
         </w:tc>
         <w:tc>
           <w:tcPr>
-            <w:tcW w:type="dxa" w:w="2160"/>
+            <w:tcW w:type="dxa" w:w="2880"/>
           </w:tcPr>
           <w:p>
             <w:r>
@@ -2267,17 +1986,7 @@
       <w:tr>
         <w:tc>
           <w:tcPr>
-            <w:tcW w:type="dxa" w:w="2160"/>
-          </w:tcPr>
-          <w:p>
-            <w:r>
-              <w:t>28</w:t>
-            </w:r>
-          </w:p>
-        </w:tc>
-        <w:tc>
-          <w:tcPr>
-            <w:tcW w:type="dxa" w:w="2160"/>
+            <w:tcW w:type="dxa" w:w="2880"/>
           </w:tcPr>
           <w:p>
             <w:r>
@@ -2289,7 +1998,7 @@
         </w:tc>
         <w:tc>
           <w:tcPr>
-            <w:tcW w:type="dxa" w:w="2160"/>
+            <w:tcW w:type="dxa" w:w="2880"/>
           </w:tcPr>
           <w:p>
             <w:hyperlink r:id="rId63">
@@ -2298,14 +2007,14 @@
                   <w:color w:val="0000FF"/>
                   <w:u w:val="single"/>
                 </w:rPr>
-                <w:t>https://primgallery.com/#p=28</w:t>
+                <w:t>https://aganimka.github.io/Gallery-site/#p=28</w:t>
               </w:r>
             </w:hyperlink>
           </w:p>
         </w:tc>
         <w:tc>
           <w:tcPr>
-            <w:tcW w:type="dxa" w:w="2160"/>
+            <w:tcW w:type="dxa" w:w="2880"/>
           </w:tcPr>
           <w:p>
             <w:r>
@@ -2348,17 +2057,7 @@
       <w:tr>
         <w:tc>
           <w:tcPr>
-            <w:tcW w:type="dxa" w:w="2160"/>
-          </w:tcPr>
-          <w:p>
-            <w:r>
-              <w:t>29</w:t>
-            </w:r>
-          </w:p>
-        </w:tc>
-        <w:tc>
-          <w:tcPr>
-            <w:tcW w:type="dxa" w:w="2160"/>
+            <w:tcW w:type="dxa" w:w="2880"/>
           </w:tcPr>
           <w:p>
             <w:r>
@@ -2370,7 +2069,7 @@
         </w:tc>
         <w:tc>
           <w:tcPr>
-            <w:tcW w:type="dxa" w:w="2160"/>
+            <w:tcW w:type="dxa" w:w="2880"/>
           </w:tcPr>
           <w:p>
             <w:hyperlink r:id="rId65">
@@ -2379,14 +2078,14 @@
                   <w:color w:val="0000FF"/>
                   <w:u w:val="single"/>
                 </w:rPr>
-                <w:t>https://primgallery.com/#p=29</w:t>
+                <w:t>https://aganimka.github.io/Gallery-site/#p=29</w:t>
               </w:r>
             </w:hyperlink>
           </w:p>
         </w:tc>
         <w:tc>
           <w:tcPr>
-            <w:tcW w:type="dxa" w:w="2160"/>
+            <w:tcW w:type="dxa" w:w="2880"/>
           </w:tcPr>
           <w:p>
             <w:r>

</xml_diff>